<commit_message>
changed made stable functional and started to do normal interface
</commit_message>
<xml_diff>
--- a/Documents/31П_отчет по УП.docx
+++ b/Documents/31П_отчет по УП.docx
@@ -1065,149 +1065,202 @@
     </w:p>
     <w:p>
       <w:pPr>
-        <w:rPr>
-          <w:color w:val="000000" w:themeColor="text1"/>
-        </w:rPr>
-      </w:pPr>
-      <w:r>
-        <w:rPr>
-          <w:color w:val="000000" w:themeColor="text1"/>
-        </w:rPr>
-        <w:t>• ПК 2.1. Разрабатывать требования к программным модулям на основе анализа проектной и технической документации.</w:t>
-      </w:r>
-    </w:p>
-    <w:p>
-      <w:pPr>
-        <w:rPr>
-          <w:color w:val="000000" w:themeColor="text1"/>
-        </w:rPr>
-      </w:pPr>
-      <w:r>
-        <w:rPr>
-          <w:color w:val="000000" w:themeColor="text1"/>
-        </w:rPr>
-        <w:t>• ПК 2.2. Выполнять интеграцию модулей в программное обеспечение.</w:t>
-      </w:r>
-    </w:p>
-    <w:p>
-      <w:pPr>
-        <w:rPr>
-          <w:color w:val="000000" w:themeColor="text1"/>
-        </w:rPr>
-      </w:pPr>
-      <w:r>
-        <w:rPr>
-          <w:color w:val="000000" w:themeColor="text1"/>
-        </w:rPr>
-        <w:t>• ПК 2.3. Выполнять отладку программного модуля с использованием специализированных программных средств.</w:t>
-      </w:r>
-    </w:p>
-    <w:p>
-      <w:pPr>
-        <w:rPr>
-          <w:color w:val="000000" w:themeColor="text1"/>
-        </w:rPr>
-      </w:pPr>
-      <w:r>
-        <w:rPr>
-          <w:color w:val="000000" w:themeColor="text1"/>
-        </w:rPr>
-        <w:t>• ПК 2.4. Осуществлять разработку тестовых наборов и тестовых сценариев для программного обеспечения.</w:t>
-      </w:r>
-    </w:p>
-    <w:p>
-      <w:pPr>
-        <w:rPr>
-          <w:color w:val="000000" w:themeColor="text1"/>
-        </w:rPr>
-      </w:pPr>
-      <w:r>
-        <w:rPr>
-          <w:color w:val="000000" w:themeColor="text1"/>
-        </w:rPr>
-        <w:t>• ПК 2.5. Производить инспектирование компонент программного обеспечения на предмет соответствия стандартам кодирования.</w:t>
-      </w:r>
-    </w:p>
-    <w:p>
-      <w:pPr>
-        <w:rPr>
-          <w:color w:val="000000" w:themeColor="text1"/>
-        </w:rPr>
-      </w:pPr>
-      <w:r>
-        <w:rPr>
-          <w:color w:val="000000" w:themeColor="text1"/>
-        </w:rPr>
-        <w:t>• ОК 01. Выбирать способы решения задач профессиональной деятельности применительно к различным контекстам.</w:t>
-      </w:r>
-    </w:p>
-    <w:p>
-      <w:pPr>
-        <w:rPr>
-          <w:color w:val="000000" w:themeColor="text1"/>
-        </w:rPr>
-      </w:pPr>
-      <w:r>
-        <w:rPr>
-          <w:color w:val="000000" w:themeColor="text1"/>
-        </w:rPr>
-        <w:t>• ОК 02. Использовать современные средства поиска, анализа и интерпретации информации, а также информационные технологии для выполнения задач профессиональной деятельности.</w:t>
-      </w:r>
-    </w:p>
-    <w:p>
-      <w:pPr>
-        <w:rPr>
-          <w:color w:val="000000" w:themeColor="text1"/>
-        </w:rPr>
-      </w:pPr>
-      <w:r>
-        <w:rPr>
-          <w:color w:val="000000" w:themeColor="text1"/>
-        </w:rPr>
-        <w:t>• ОК 04. Эффективно взаимодействовать и работать в коллективе и команде.</w:t>
-      </w:r>
-    </w:p>
-    <w:p>
-      <w:pPr>
-        <w:rPr>
-          <w:color w:val="000000" w:themeColor="text1"/>
-        </w:rPr>
-      </w:pPr>
-      <w:r>
-        <w:rPr>
-          <w:color w:val="000000" w:themeColor="text1"/>
-        </w:rPr>
-        <w:t>• ОК 05. Осуществлять устную и письменную коммуникацию на государственном языке с учётом особенностей социального и культурного контекста.</w:t>
-      </w:r>
-    </w:p>
-    <w:p>
-      <w:pPr>
-        <w:rPr>
-          <w:color w:val="000000" w:themeColor="text1"/>
-        </w:rPr>
-      </w:pPr>
-      <w:r>
-        <w:rPr>
-          <w:color w:val="000000" w:themeColor="text1"/>
-        </w:rPr>
-        <w:t>• ОК 09. Использовать информационные технологии в профессиональной деятельности.</w:t>
-      </w:r>
-    </w:p>
-    <w:p>
-      <w:pPr>
-        <w:rPr>
-          <w:color w:val="000000" w:themeColor="text1"/>
-        </w:rPr>
-      </w:pPr>
-      <w:r>
-        <w:rPr>
-          <w:color w:val="000000" w:themeColor="text1"/>
-        </w:rPr>
-        <w:t>• ОК 10. Пользоваться профессиональной документацией на государственном и иностранном языках.</w:t>
-      </w:r>
-    </w:p>
-    <w:p>
-      <w:pPr>
+        <w:pStyle w:val="a7"/>
+        <w:numPr>
+          <w:ilvl w:val="0"/>
+          <w:numId w:val="46"/>
+        </w:numPr>
+        <w:ind w:left="1276"/>
+        <w:rPr>
+          <w:color w:val="000000" w:themeColor="text1"/>
+        </w:rPr>
+      </w:pPr>
+      <w:r>
+        <w:rPr>
+          <w:color w:val="000000" w:themeColor="text1"/>
+        </w:rPr>
+        <w:t>ПК 2.1. Разрабатывать требования к программным модулям на основе анализа проектной и технической документации.</w:t>
+      </w:r>
+    </w:p>
+    <w:p>
+      <w:pPr>
+        <w:pStyle w:val="a7"/>
+        <w:numPr>
+          <w:ilvl w:val="0"/>
+          <w:numId w:val="46"/>
+        </w:numPr>
+        <w:ind w:left="1276"/>
+        <w:rPr>
+          <w:color w:val="000000" w:themeColor="text1"/>
+        </w:rPr>
+      </w:pPr>
+      <w:r>
+        <w:rPr>
+          <w:color w:val="000000" w:themeColor="text1"/>
+        </w:rPr>
+        <w:t>ПК 2.2. Выполнять интеграцию модулей в программное обеспечение.</w:t>
+      </w:r>
+    </w:p>
+    <w:p>
+      <w:pPr>
+        <w:pStyle w:val="a7"/>
+        <w:numPr>
+          <w:ilvl w:val="0"/>
+          <w:numId w:val="46"/>
+        </w:numPr>
+        <w:ind w:left="1276"/>
+        <w:rPr>
+          <w:color w:val="000000" w:themeColor="text1"/>
+        </w:rPr>
+      </w:pPr>
+      <w:r>
+        <w:rPr>
+          <w:color w:val="000000" w:themeColor="text1"/>
+        </w:rPr>
+        <w:t>ПК 2.3. Выполнять отладку программного модуля с использованием специализированных программных средств.</w:t>
+      </w:r>
+    </w:p>
+    <w:p>
+      <w:pPr>
+        <w:pStyle w:val="a7"/>
+        <w:numPr>
+          <w:ilvl w:val="0"/>
+          <w:numId w:val="46"/>
+        </w:numPr>
+        <w:ind w:left="1276"/>
+        <w:rPr>
+          <w:color w:val="000000" w:themeColor="text1"/>
+        </w:rPr>
+      </w:pPr>
+      <w:r>
+        <w:rPr>
+          <w:color w:val="000000" w:themeColor="text1"/>
+        </w:rPr>
+        <w:t>ПК 2.4. Осуществлять разработку тестовых наборов и тестовых сценариев для программного обеспечения.</w:t>
+      </w:r>
+    </w:p>
+    <w:p>
+      <w:pPr>
+        <w:pStyle w:val="a7"/>
+        <w:numPr>
+          <w:ilvl w:val="0"/>
+          <w:numId w:val="46"/>
+        </w:numPr>
+        <w:ind w:left="1276"/>
+        <w:rPr>
+          <w:color w:val="000000" w:themeColor="text1"/>
+        </w:rPr>
+      </w:pPr>
+      <w:r>
+        <w:rPr>
+          <w:color w:val="000000" w:themeColor="text1"/>
+        </w:rPr>
+        <w:t>ПК 2.5. Производить инспектирование компонент программного обеспечения на предмет соответствия стандартам кодирования.</w:t>
+      </w:r>
+    </w:p>
+    <w:p>
+      <w:pPr>
+        <w:pStyle w:val="a7"/>
+        <w:numPr>
+          <w:ilvl w:val="0"/>
+          <w:numId w:val="46"/>
+        </w:numPr>
+        <w:ind w:left="1276"/>
+        <w:rPr>
+          <w:color w:val="000000" w:themeColor="text1"/>
+        </w:rPr>
+      </w:pPr>
+      <w:r>
+        <w:rPr>
+          <w:color w:val="000000" w:themeColor="text1"/>
+        </w:rPr>
+        <w:t>ОК 01. Выбирать способы решения задач профессиональной деятельности применительно к различным контекстам.</w:t>
+      </w:r>
+    </w:p>
+    <w:p>
+      <w:pPr>
+        <w:pStyle w:val="a7"/>
+        <w:numPr>
+          <w:ilvl w:val="0"/>
+          <w:numId w:val="46"/>
+        </w:numPr>
+        <w:ind w:left="1276"/>
+        <w:rPr>
+          <w:color w:val="000000" w:themeColor="text1"/>
+        </w:rPr>
+      </w:pPr>
+      <w:r>
+        <w:rPr>
+          <w:color w:val="000000" w:themeColor="text1"/>
+        </w:rPr>
+        <w:t>ОК 02. Использовать современные средства поиска, анализа и интерпретации информации, а также информационные технологии для выполнения задач профессиональной деятельности.</w:t>
+      </w:r>
+    </w:p>
+    <w:p>
+      <w:pPr>
+        <w:pStyle w:val="a7"/>
+        <w:numPr>
+          <w:ilvl w:val="0"/>
+          <w:numId w:val="46"/>
+        </w:numPr>
+        <w:ind w:left="1276"/>
+        <w:rPr>
+          <w:color w:val="000000" w:themeColor="text1"/>
+        </w:rPr>
+      </w:pPr>
+      <w:r>
+        <w:rPr>
+          <w:color w:val="000000" w:themeColor="text1"/>
+        </w:rPr>
+        <w:t>ОК 04. Эффективно взаимодействовать и работать в коллективе и команде.</w:t>
+      </w:r>
+    </w:p>
+    <w:p>
+      <w:pPr>
+        <w:pStyle w:val="a7"/>
+        <w:numPr>
+          <w:ilvl w:val="0"/>
+          <w:numId w:val="46"/>
+        </w:numPr>
+        <w:ind w:left="1276"/>
+        <w:rPr>
+          <w:color w:val="000000" w:themeColor="text1"/>
+        </w:rPr>
+      </w:pPr>
+      <w:r>
+        <w:rPr>
+          <w:color w:val="000000" w:themeColor="text1"/>
+        </w:rPr>
+        <w:t>ОК 05. Осуществлять устную и письменную коммуникацию на государственном языке с учётом особенностей социального и культурного контекста.</w:t>
+      </w:r>
+    </w:p>
+    <w:p>
+      <w:pPr>
+        <w:pStyle w:val="a7"/>
+        <w:numPr>
+          <w:ilvl w:val="0"/>
+          <w:numId w:val="46"/>
+        </w:numPr>
+        <w:ind w:left="1276"/>
+        <w:rPr>
+          <w:color w:val="000000" w:themeColor="text1"/>
+        </w:rPr>
+      </w:pPr>
+      <w:r>
+        <w:rPr>
+          <w:color w:val="000000" w:themeColor="text1"/>
+        </w:rPr>
+        <w:t>ОК 09. Использовать информационные технологии в профессиональной деятельности.</w:t>
+      </w:r>
+    </w:p>
+    <w:p>
+      <w:pPr>
+        <w:pStyle w:val="a7"/>
+        <w:numPr>
+          <w:ilvl w:val="0"/>
+          <w:numId w:val="46"/>
+        </w:numPr>
+        <w:ind w:left="1276"/>
         <w:rPr>
           <w:color w:val="000000" w:themeColor="text1"/>
         </w:rPr>
@@ -1217,6 +1270,19 @@
           <w:color w:val="000000" w:themeColor="text1"/>
         </w:rPr>
         <w:lastRenderedPageBreak/>
+        <w:t>ОК 10. Пользоваться профессиональной документацией на государственном и иностранном языках.</w:t>
+      </w:r>
+    </w:p>
+    <w:p>
+      <w:pPr>
+        <w:rPr>
+          <w:color w:val="000000" w:themeColor="text1"/>
+        </w:rPr>
+      </w:pPr>
+      <w:r>
+        <w:rPr>
+          <w:color w:val="000000" w:themeColor="text1"/>
+        </w:rPr>
         <w:t>Для достижения поставленной цели в ходе учебной практики было необходимо решить следующие задачи:</w:t>
       </w:r>
     </w:p>
@@ -1227,7 +1293,7 @@
           <w:ilvl w:val="0"/>
           <w:numId w:val="12"/>
         </w:numPr>
-        <w:ind w:left="0" w:firstLine="709"/>
+        <w:ind w:left="1276" w:hanging="283"/>
         <w:rPr>
           <w:color w:val="000000" w:themeColor="text1"/>
         </w:rPr>
@@ -1246,7 +1312,7 @@
           <w:ilvl w:val="0"/>
           <w:numId w:val="12"/>
         </w:numPr>
-        <w:ind w:left="0" w:firstLine="709"/>
+        <w:ind w:left="1276" w:hanging="283"/>
         <w:rPr>
           <w:color w:val="000000" w:themeColor="text1"/>
         </w:rPr>
@@ -1265,7 +1331,7 @@
           <w:ilvl w:val="0"/>
           <w:numId w:val="12"/>
         </w:numPr>
-        <w:ind w:left="0" w:firstLine="709"/>
+        <w:ind w:left="1276" w:hanging="283"/>
         <w:rPr>
           <w:color w:val="000000" w:themeColor="text1"/>
         </w:rPr>
@@ -1313,7 +1379,7 @@
           <w:ilvl w:val="0"/>
           <w:numId w:val="12"/>
         </w:numPr>
-        <w:ind w:left="0" w:firstLine="709"/>
+        <w:ind w:left="1276" w:hanging="283"/>
         <w:rPr>
           <w:color w:val="000000" w:themeColor="text1"/>
         </w:rPr>
@@ -1332,7 +1398,7 @@
           <w:ilvl w:val="0"/>
           <w:numId w:val="12"/>
         </w:numPr>
-        <w:ind w:left="0" w:firstLine="709"/>
+        <w:ind w:left="1276" w:hanging="283"/>
         <w:rPr>
           <w:color w:val="000000" w:themeColor="text1"/>
         </w:rPr>
@@ -1365,7 +1431,7 @@
           <w:ilvl w:val="0"/>
           <w:numId w:val="12"/>
         </w:numPr>
-        <w:ind w:left="0" w:firstLine="709"/>
+        <w:ind w:left="1276" w:hanging="283"/>
         <w:rPr>
           <w:color w:val="000000" w:themeColor="text1"/>
         </w:rPr>
@@ -1384,7 +1450,7 @@
           <w:ilvl w:val="0"/>
           <w:numId w:val="12"/>
         </w:numPr>
-        <w:ind w:left="0" w:firstLine="709"/>
+        <w:ind w:left="1276" w:hanging="283"/>
         <w:rPr>
           <w:color w:val="000000" w:themeColor="text1"/>
         </w:rPr>
@@ -1403,7 +1469,7 @@
           <w:ilvl w:val="0"/>
           <w:numId w:val="12"/>
         </w:numPr>
-        <w:ind w:left="0" w:firstLine="709"/>
+        <w:ind w:left="1276" w:hanging="283"/>
         <w:rPr>
           <w:color w:val="000000" w:themeColor="text1"/>
         </w:rPr>
@@ -1422,7 +1488,7 @@
           <w:ilvl w:val="0"/>
           <w:numId w:val="12"/>
         </w:numPr>
-        <w:ind w:left="0" w:firstLine="709"/>
+        <w:ind w:left="1276" w:hanging="283"/>
         <w:rPr>
           <w:color w:val="000000" w:themeColor="text1"/>
         </w:rPr>
@@ -1469,7 +1535,7 @@
           <w:ilvl w:val="0"/>
           <w:numId w:val="12"/>
         </w:numPr>
-        <w:ind w:left="0" w:firstLine="709"/>
+        <w:ind w:left="1276" w:hanging="283"/>
         <w:rPr>
           <w:color w:val="000000" w:themeColor="text1"/>
         </w:rPr>
@@ -5030,7 +5096,6 @@
         <w:pStyle w:val="1"/>
         <w:rPr>
           <w:szCs w:val="28"/>
-          <w:lang w:val="en-US"/>
         </w:rPr>
       </w:pPr>
       <w:bookmarkStart w:id="3" w:name="_Toc216261933"/>
@@ -5044,7 +5109,6 @@
       <w:r>
         <w:rPr>
           <w:szCs w:val="28"/>
-          <w:lang w:val="en-US"/>
         </w:rPr>
         <w:t xml:space="preserve"> </w:t>
       </w:r>
@@ -8016,6 +8080,118 @@
     </w:lvl>
   </w:abstractNum>
   <w:abstractNum w:abstractNumId="19" w15:restartNumberingAfterBreak="0">
+    <w:nsid w:val="2AAD7168"/>
+    <w:multiLevelType w:val="hybridMultilevel"/>
+    <w:tmpl w:val="9CE802F8"/>
+    <w:lvl w:ilvl="0" w:tplc="9BCC8F58">
+      <w:numFmt w:val="bullet"/>
+      <w:lvlText w:val="•"/>
+      <w:lvlJc w:val="left"/>
+      <w:pPr>
+        <w:ind w:left="1069" w:hanging="360"/>
+      </w:pPr>
+      <w:rPr>
+        <w:rFonts w:ascii="Times New Roman" w:eastAsiaTheme="minorHAnsi" w:hAnsi="Times New Roman" w:cs="Times New Roman" w:hint="default"/>
+      </w:rPr>
+    </w:lvl>
+    <w:lvl w:ilvl="1" w:tplc="04190003" w:tentative="1">
+      <w:start w:val="1"/>
+      <w:numFmt w:val="bullet"/>
+      <w:lvlText w:val="o"/>
+      <w:lvlJc w:val="left"/>
+      <w:pPr>
+        <w:ind w:left="1789" w:hanging="360"/>
+      </w:pPr>
+      <w:rPr>
+        <w:rFonts w:ascii="Courier New" w:hAnsi="Courier New" w:cs="Courier New" w:hint="default"/>
+      </w:rPr>
+    </w:lvl>
+    <w:lvl w:ilvl="2" w:tplc="04190005" w:tentative="1">
+      <w:start w:val="1"/>
+      <w:numFmt w:val="bullet"/>
+      <w:lvlText w:val=""/>
+      <w:lvlJc w:val="left"/>
+      <w:pPr>
+        <w:ind w:left="2509" w:hanging="360"/>
+      </w:pPr>
+      <w:rPr>
+        <w:rFonts w:ascii="Wingdings" w:hAnsi="Wingdings" w:hint="default"/>
+      </w:rPr>
+    </w:lvl>
+    <w:lvl w:ilvl="3" w:tplc="04190001" w:tentative="1">
+      <w:start w:val="1"/>
+      <w:numFmt w:val="bullet"/>
+      <w:lvlText w:val=""/>
+      <w:lvlJc w:val="left"/>
+      <w:pPr>
+        <w:ind w:left="3229" w:hanging="360"/>
+      </w:pPr>
+      <w:rPr>
+        <w:rFonts w:ascii="Symbol" w:hAnsi="Symbol" w:hint="default"/>
+      </w:rPr>
+    </w:lvl>
+    <w:lvl w:ilvl="4" w:tplc="04190003" w:tentative="1">
+      <w:start w:val="1"/>
+      <w:numFmt w:val="bullet"/>
+      <w:lvlText w:val="o"/>
+      <w:lvlJc w:val="left"/>
+      <w:pPr>
+        <w:ind w:left="3949" w:hanging="360"/>
+      </w:pPr>
+      <w:rPr>
+        <w:rFonts w:ascii="Courier New" w:hAnsi="Courier New" w:cs="Courier New" w:hint="default"/>
+      </w:rPr>
+    </w:lvl>
+    <w:lvl w:ilvl="5" w:tplc="04190005" w:tentative="1">
+      <w:start w:val="1"/>
+      <w:numFmt w:val="bullet"/>
+      <w:lvlText w:val=""/>
+      <w:lvlJc w:val="left"/>
+      <w:pPr>
+        <w:ind w:left="4669" w:hanging="360"/>
+      </w:pPr>
+      <w:rPr>
+        <w:rFonts w:ascii="Wingdings" w:hAnsi="Wingdings" w:hint="default"/>
+      </w:rPr>
+    </w:lvl>
+    <w:lvl w:ilvl="6" w:tplc="04190001" w:tentative="1">
+      <w:start w:val="1"/>
+      <w:numFmt w:val="bullet"/>
+      <w:lvlText w:val=""/>
+      <w:lvlJc w:val="left"/>
+      <w:pPr>
+        <w:ind w:left="5389" w:hanging="360"/>
+      </w:pPr>
+      <w:rPr>
+        <w:rFonts w:ascii="Symbol" w:hAnsi="Symbol" w:hint="default"/>
+      </w:rPr>
+    </w:lvl>
+    <w:lvl w:ilvl="7" w:tplc="04190003" w:tentative="1">
+      <w:start w:val="1"/>
+      <w:numFmt w:val="bullet"/>
+      <w:lvlText w:val="o"/>
+      <w:lvlJc w:val="left"/>
+      <w:pPr>
+        <w:ind w:left="6109" w:hanging="360"/>
+      </w:pPr>
+      <w:rPr>
+        <w:rFonts w:ascii="Courier New" w:hAnsi="Courier New" w:cs="Courier New" w:hint="default"/>
+      </w:rPr>
+    </w:lvl>
+    <w:lvl w:ilvl="8" w:tplc="04190005" w:tentative="1">
+      <w:start w:val="1"/>
+      <w:numFmt w:val="bullet"/>
+      <w:lvlText w:val=""/>
+      <w:lvlJc w:val="left"/>
+      <w:pPr>
+        <w:ind w:left="6829" w:hanging="360"/>
+      </w:pPr>
+      <w:rPr>
+        <w:rFonts w:ascii="Wingdings" w:hAnsi="Wingdings" w:hint="default"/>
+      </w:rPr>
+    </w:lvl>
+  </w:abstractNum>
+  <w:abstractNum w:abstractNumId="20" w15:restartNumberingAfterBreak="0">
     <w:nsid w:val="2E884A97"/>
     <w:multiLevelType w:val="multilevel"/>
     <w:tmpl w:val="9E7A19AE"/>
@@ -8164,7 +8340,120 @@
       </w:rPr>
     </w:lvl>
   </w:abstractNum>
-  <w:abstractNum w:abstractNumId="20" w15:restartNumberingAfterBreak="0">
+  <w:abstractNum w:abstractNumId="21" w15:restartNumberingAfterBreak="0">
+    <w:nsid w:val="30AE51FD"/>
+    <w:multiLevelType w:val="hybridMultilevel"/>
+    <w:tmpl w:val="2A46143C"/>
+    <w:lvl w:ilvl="0" w:tplc="04190001">
+      <w:start w:val="1"/>
+      <w:numFmt w:val="bullet"/>
+      <w:lvlText w:val=""/>
+      <w:lvlJc w:val="left"/>
+      <w:pPr>
+        <w:ind w:left="1429" w:hanging="360"/>
+      </w:pPr>
+      <w:rPr>
+        <w:rFonts w:ascii="Symbol" w:hAnsi="Symbol" w:hint="default"/>
+      </w:rPr>
+    </w:lvl>
+    <w:lvl w:ilvl="1" w:tplc="04190003" w:tentative="1">
+      <w:start w:val="1"/>
+      <w:numFmt w:val="bullet"/>
+      <w:lvlText w:val="o"/>
+      <w:lvlJc w:val="left"/>
+      <w:pPr>
+        <w:ind w:left="2149" w:hanging="360"/>
+      </w:pPr>
+      <w:rPr>
+        <w:rFonts w:ascii="Courier New" w:hAnsi="Courier New" w:cs="Courier New" w:hint="default"/>
+      </w:rPr>
+    </w:lvl>
+    <w:lvl w:ilvl="2" w:tplc="04190005" w:tentative="1">
+      <w:start w:val="1"/>
+      <w:numFmt w:val="bullet"/>
+      <w:lvlText w:val=""/>
+      <w:lvlJc w:val="left"/>
+      <w:pPr>
+        <w:ind w:left="2869" w:hanging="360"/>
+      </w:pPr>
+      <w:rPr>
+        <w:rFonts w:ascii="Wingdings" w:hAnsi="Wingdings" w:hint="default"/>
+      </w:rPr>
+    </w:lvl>
+    <w:lvl w:ilvl="3" w:tplc="04190001" w:tentative="1">
+      <w:start w:val="1"/>
+      <w:numFmt w:val="bullet"/>
+      <w:lvlText w:val=""/>
+      <w:lvlJc w:val="left"/>
+      <w:pPr>
+        <w:ind w:left="3589" w:hanging="360"/>
+      </w:pPr>
+      <w:rPr>
+        <w:rFonts w:ascii="Symbol" w:hAnsi="Symbol" w:hint="default"/>
+      </w:rPr>
+    </w:lvl>
+    <w:lvl w:ilvl="4" w:tplc="04190003" w:tentative="1">
+      <w:start w:val="1"/>
+      <w:numFmt w:val="bullet"/>
+      <w:lvlText w:val="o"/>
+      <w:lvlJc w:val="left"/>
+      <w:pPr>
+        <w:ind w:left="4309" w:hanging="360"/>
+      </w:pPr>
+      <w:rPr>
+        <w:rFonts w:ascii="Courier New" w:hAnsi="Courier New" w:cs="Courier New" w:hint="default"/>
+      </w:rPr>
+    </w:lvl>
+    <w:lvl w:ilvl="5" w:tplc="04190005" w:tentative="1">
+      <w:start w:val="1"/>
+      <w:numFmt w:val="bullet"/>
+      <w:lvlText w:val=""/>
+      <w:lvlJc w:val="left"/>
+      <w:pPr>
+        <w:ind w:left="5029" w:hanging="360"/>
+      </w:pPr>
+      <w:rPr>
+        <w:rFonts w:ascii="Wingdings" w:hAnsi="Wingdings" w:hint="default"/>
+      </w:rPr>
+    </w:lvl>
+    <w:lvl w:ilvl="6" w:tplc="04190001" w:tentative="1">
+      <w:start w:val="1"/>
+      <w:numFmt w:val="bullet"/>
+      <w:lvlText w:val=""/>
+      <w:lvlJc w:val="left"/>
+      <w:pPr>
+        <w:ind w:left="5749" w:hanging="360"/>
+      </w:pPr>
+      <w:rPr>
+        <w:rFonts w:ascii="Symbol" w:hAnsi="Symbol" w:hint="default"/>
+      </w:rPr>
+    </w:lvl>
+    <w:lvl w:ilvl="7" w:tplc="04190003" w:tentative="1">
+      <w:start w:val="1"/>
+      <w:numFmt w:val="bullet"/>
+      <w:lvlText w:val="o"/>
+      <w:lvlJc w:val="left"/>
+      <w:pPr>
+        <w:ind w:left="6469" w:hanging="360"/>
+      </w:pPr>
+      <w:rPr>
+        <w:rFonts w:ascii="Courier New" w:hAnsi="Courier New" w:cs="Courier New" w:hint="default"/>
+      </w:rPr>
+    </w:lvl>
+    <w:lvl w:ilvl="8" w:tplc="04190005" w:tentative="1">
+      <w:start w:val="1"/>
+      <w:numFmt w:val="bullet"/>
+      <w:lvlText w:val=""/>
+      <w:lvlJc w:val="left"/>
+      <w:pPr>
+        <w:ind w:left="7189" w:hanging="360"/>
+      </w:pPr>
+      <w:rPr>
+        <w:rFonts w:ascii="Wingdings" w:hAnsi="Wingdings" w:hint="default"/>
+      </w:rPr>
+    </w:lvl>
+  </w:abstractNum>
+  <w:abstractNum w:abstractNumId="22" w15:restartNumberingAfterBreak="0">
     <w:nsid w:val="356A5AD3"/>
     <w:multiLevelType w:val="multilevel"/>
     <w:tmpl w:val="2BE08F8E"/>
@@ -8313,7 +8602,7 @@
       </w:rPr>
     </w:lvl>
   </w:abstractNum>
-  <w:abstractNum w:abstractNumId="21" w15:restartNumberingAfterBreak="0">
+  <w:abstractNum w:abstractNumId="23" w15:restartNumberingAfterBreak="0">
     <w:nsid w:val="3AAF1B02"/>
     <w:multiLevelType w:val="multilevel"/>
     <w:tmpl w:val="9E8613AC"/>
@@ -8462,7 +8751,7 @@
       </w:rPr>
     </w:lvl>
   </w:abstractNum>
-  <w:abstractNum w:abstractNumId="22" w15:restartNumberingAfterBreak="0">
+  <w:abstractNum w:abstractNumId="24" w15:restartNumberingAfterBreak="0">
     <w:nsid w:val="3F101A3D"/>
     <w:multiLevelType w:val="multilevel"/>
     <w:tmpl w:val="96C8EC70"/>
@@ -8611,7 +8900,7 @@
       </w:rPr>
     </w:lvl>
   </w:abstractNum>
-  <w:abstractNum w:abstractNumId="23" w15:restartNumberingAfterBreak="0">
+  <w:abstractNum w:abstractNumId="25" w15:restartNumberingAfterBreak="0">
     <w:nsid w:val="409F55DB"/>
     <w:multiLevelType w:val="multilevel"/>
     <w:tmpl w:val="06682080"/>
@@ -8760,7 +9049,7 @@
       </w:rPr>
     </w:lvl>
   </w:abstractNum>
-  <w:abstractNum w:abstractNumId="24" w15:restartNumberingAfterBreak="0">
+  <w:abstractNum w:abstractNumId="26" w15:restartNumberingAfterBreak="0">
     <w:nsid w:val="42631C7E"/>
     <w:multiLevelType w:val="multilevel"/>
     <w:tmpl w:val="EAEE2DA2"/>
@@ -8909,7 +9198,7 @@
       </w:rPr>
     </w:lvl>
   </w:abstractNum>
-  <w:abstractNum w:abstractNumId="25" w15:restartNumberingAfterBreak="0">
+  <w:abstractNum w:abstractNumId="27" w15:restartNumberingAfterBreak="0">
     <w:nsid w:val="45DD0220"/>
     <w:multiLevelType w:val="multilevel"/>
     <w:tmpl w:val="5552A3E6"/>
@@ -9058,7 +9347,7 @@
       </w:rPr>
     </w:lvl>
   </w:abstractNum>
-  <w:abstractNum w:abstractNumId="26" w15:restartNumberingAfterBreak="0">
+  <w:abstractNum w:abstractNumId="28" w15:restartNumberingAfterBreak="0">
     <w:nsid w:val="4D4C240C"/>
     <w:multiLevelType w:val="multilevel"/>
     <w:tmpl w:val="3F0E7F22"/>
@@ -9207,7 +9496,7 @@
       </w:rPr>
     </w:lvl>
   </w:abstractNum>
-  <w:abstractNum w:abstractNumId="27" w15:restartNumberingAfterBreak="0">
+  <w:abstractNum w:abstractNumId="29" w15:restartNumberingAfterBreak="0">
     <w:nsid w:val="536C1BDA"/>
     <w:multiLevelType w:val="multilevel"/>
     <w:tmpl w:val="3CCE132E"/>
@@ -9320,7 +9609,7 @@
       </w:pPr>
     </w:lvl>
   </w:abstractNum>
-  <w:abstractNum w:abstractNumId="28" w15:restartNumberingAfterBreak="0">
+  <w:abstractNum w:abstractNumId="30" w15:restartNumberingAfterBreak="0">
     <w:nsid w:val="546A3EA7"/>
     <w:multiLevelType w:val="multilevel"/>
     <w:tmpl w:val="82706A90"/>
@@ -9469,7 +9758,7 @@
       </w:rPr>
     </w:lvl>
   </w:abstractNum>
-  <w:abstractNum w:abstractNumId="29" w15:restartNumberingAfterBreak="0">
+  <w:abstractNum w:abstractNumId="31" w15:restartNumberingAfterBreak="0">
     <w:nsid w:val="586010AF"/>
     <w:multiLevelType w:val="multilevel"/>
     <w:tmpl w:val="9BBCEFDE"/>
@@ -9618,7 +9907,7 @@
       </w:rPr>
     </w:lvl>
   </w:abstractNum>
-  <w:abstractNum w:abstractNumId="30" w15:restartNumberingAfterBreak="0">
+  <w:abstractNum w:abstractNumId="32" w15:restartNumberingAfterBreak="0">
     <w:nsid w:val="5FC5416E"/>
     <w:multiLevelType w:val="multilevel"/>
     <w:tmpl w:val="CCDCD3F8"/>
@@ -9767,7 +10056,7 @@
       </w:rPr>
     </w:lvl>
   </w:abstractNum>
-  <w:abstractNum w:abstractNumId="31" w15:restartNumberingAfterBreak="0">
+  <w:abstractNum w:abstractNumId="33" w15:restartNumberingAfterBreak="0">
     <w:nsid w:val="66343246"/>
     <w:multiLevelType w:val="multilevel"/>
     <w:tmpl w:val="D548A25C"/>
@@ -9880,7 +10169,7 @@
       </w:pPr>
     </w:lvl>
   </w:abstractNum>
-  <w:abstractNum w:abstractNumId="32" w15:restartNumberingAfterBreak="0">
+  <w:abstractNum w:abstractNumId="34" w15:restartNumberingAfterBreak="0">
     <w:nsid w:val="66C735E6"/>
     <w:multiLevelType w:val="multilevel"/>
     <w:tmpl w:val="DA5EEAF8"/>
@@ -9993,7 +10282,7 @@
       </w:pPr>
     </w:lvl>
   </w:abstractNum>
-  <w:abstractNum w:abstractNumId="33" w15:restartNumberingAfterBreak="0">
+  <w:abstractNum w:abstractNumId="35" w15:restartNumberingAfterBreak="0">
     <w:nsid w:val="66D54D36"/>
     <w:multiLevelType w:val="multilevel"/>
     <w:tmpl w:val="87E831AC"/>
@@ -10142,7 +10431,7 @@
       </w:rPr>
     </w:lvl>
   </w:abstractNum>
-  <w:abstractNum w:abstractNumId="34" w15:restartNumberingAfterBreak="0">
+  <w:abstractNum w:abstractNumId="36" w15:restartNumberingAfterBreak="0">
     <w:nsid w:val="694B3BB4"/>
     <w:multiLevelType w:val="multilevel"/>
     <w:tmpl w:val="417A6B7A"/>
@@ -10291,7 +10580,7 @@
       </w:rPr>
     </w:lvl>
   </w:abstractNum>
-  <w:abstractNum w:abstractNumId="35" w15:restartNumberingAfterBreak="0">
+  <w:abstractNum w:abstractNumId="37" w15:restartNumberingAfterBreak="0">
     <w:nsid w:val="6F9F029E"/>
     <w:multiLevelType w:val="multilevel"/>
     <w:tmpl w:val="2D6E1990"/>
@@ -10440,7 +10729,7 @@
       </w:rPr>
     </w:lvl>
   </w:abstractNum>
-  <w:abstractNum w:abstractNumId="36" w15:restartNumberingAfterBreak="0">
+  <w:abstractNum w:abstractNumId="38" w15:restartNumberingAfterBreak="0">
     <w:nsid w:val="721C707A"/>
     <w:multiLevelType w:val="hybridMultilevel"/>
     <w:tmpl w:val="9D345962"/>
@@ -10526,7 +10815,7 @@
       </w:pPr>
     </w:lvl>
   </w:abstractNum>
-  <w:abstractNum w:abstractNumId="37" w15:restartNumberingAfterBreak="0">
+  <w:abstractNum w:abstractNumId="39" w15:restartNumberingAfterBreak="0">
     <w:nsid w:val="724C19B0"/>
     <w:multiLevelType w:val="multilevel"/>
     <w:tmpl w:val="74F0B000"/>
@@ -10675,7 +10964,7 @@
       </w:rPr>
     </w:lvl>
   </w:abstractNum>
-  <w:abstractNum w:abstractNumId="38" w15:restartNumberingAfterBreak="0">
+  <w:abstractNum w:abstractNumId="40" w15:restartNumberingAfterBreak="0">
     <w:nsid w:val="73501891"/>
     <w:multiLevelType w:val="multilevel"/>
     <w:tmpl w:val="36CC8778"/>
@@ -10824,7 +11113,7 @@
       </w:rPr>
     </w:lvl>
   </w:abstractNum>
-  <w:abstractNum w:abstractNumId="39" w15:restartNumberingAfterBreak="0">
+  <w:abstractNum w:abstractNumId="41" w15:restartNumberingAfterBreak="0">
     <w:nsid w:val="73BE0395"/>
     <w:multiLevelType w:val="multilevel"/>
     <w:tmpl w:val="1EEEE33E"/>
@@ -10973,7 +11262,7 @@
       </w:rPr>
     </w:lvl>
   </w:abstractNum>
-  <w:abstractNum w:abstractNumId="40" w15:restartNumberingAfterBreak="0">
+  <w:abstractNum w:abstractNumId="42" w15:restartNumberingAfterBreak="0">
     <w:nsid w:val="74885D8E"/>
     <w:multiLevelType w:val="multilevel"/>
     <w:tmpl w:val="BB1A5360"/>
@@ -11122,7 +11411,7 @@
       </w:rPr>
     </w:lvl>
   </w:abstractNum>
-  <w:abstractNum w:abstractNumId="41" w15:restartNumberingAfterBreak="0">
+  <w:abstractNum w:abstractNumId="43" w15:restartNumberingAfterBreak="0">
     <w:nsid w:val="77DF0893"/>
     <w:multiLevelType w:val="hybridMultilevel"/>
     <w:tmpl w:val="276828A0"/>
@@ -11211,7 +11500,7 @@
       </w:pPr>
     </w:lvl>
   </w:abstractNum>
-  <w:abstractNum w:abstractNumId="42" w15:restartNumberingAfterBreak="0">
+  <w:abstractNum w:abstractNumId="44" w15:restartNumberingAfterBreak="0">
     <w:nsid w:val="7D7B3414"/>
     <w:multiLevelType w:val="multilevel"/>
     <w:tmpl w:val="4B5C962A"/>
@@ -11360,7 +11649,7 @@
       </w:rPr>
     </w:lvl>
   </w:abstractNum>
-  <w:abstractNum w:abstractNumId="43" w15:restartNumberingAfterBreak="0">
+  <w:abstractNum w:abstractNumId="45" w15:restartNumberingAfterBreak="0">
     <w:nsid w:val="7F34428C"/>
     <w:multiLevelType w:val="multilevel"/>
     <w:tmpl w:val="824C0530"/>
@@ -11510,7 +11799,7 @@
     </w:lvl>
   </w:abstractNum>
   <w:num w:numId="1" w16cid:durableId="336730923">
-    <w:abstractNumId w:val="27"/>
+    <w:abstractNumId w:val="29"/>
   </w:num>
   <w:num w:numId="2" w16cid:durableId="167327760">
     <w:abstractNumId w:val="0"/>
@@ -11519,7 +11808,7 @@
     <w:abstractNumId w:val="12"/>
   </w:num>
   <w:num w:numId="4" w16cid:durableId="1531453414">
-    <w:abstractNumId w:val="32"/>
+    <w:abstractNumId w:val="34"/>
   </w:num>
   <w:num w:numId="5" w16cid:durableId="1319992019">
     <w:abstractNumId w:val="17"/>
@@ -11528,49 +11817,49 @@
     <w:abstractNumId w:val="7"/>
   </w:num>
   <w:num w:numId="7" w16cid:durableId="687373040">
-    <w:abstractNumId w:val="41"/>
+    <w:abstractNumId w:val="43"/>
   </w:num>
   <w:num w:numId="8" w16cid:durableId="1287732636">
-    <w:abstractNumId w:val="24"/>
+    <w:abstractNumId w:val="26"/>
   </w:num>
   <w:num w:numId="9" w16cid:durableId="1210918591">
     <w:abstractNumId w:val="2"/>
   </w:num>
   <w:num w:numId="10" w16cid:durableId="578101721">
-    <w:abstractNumId w:val="23"/>
+    <w:abstractNumId w:val="25"/>
   </w:num>
   <w:num w:numId="11" w16cid:durableId="684671694">
-    <w:abstractNumId w:val="31"/>
+    <w:abstractNumId w:val="33"/>
   </w:num>
   <w:num w:numId="12" w16cid:durableId="1700427840">
-    <w:abstractNumId w:val="36"/>
+    <w:abstractNumId w:val="38"/>
   </w:num>
   <w:num w:numId="13" w16cid:durableId="1497259814">
     <w:abstractNumId w:val="4"/>
   </w:num>
   <w:num w:numId="14" w16cid:durableId="417168390">
-    <w:abstractNumId w:val="35"/>
+    <w:abstractNumId w:val="37"/>
   </w:num>
   <w:num w:numId="15" w16cid:durableId="1887520575">
-    <w:abstractNumId w:val="26"/>
+    <w:abstractNumId w:val="28"/>
   </w:num>
   <w:num w:numId="16" w16cid:durableId="571234382">
     <w:abstractNumId w:val="5"/>
   </w:num>
   <w:num w:numId="17" w16cid:durableId="680163715">
-    <w:abstractNumId w:val="30"/>
+    <w:abstractNumId w:val="32"/>
   </w:num>
   <w:num w:numId="18" w16cid:durableId="1145390110">
-    <w:abstractNumId w:val="37"/>
+    <w:abstractNumId w:val="39"/>
   </w:num>
   <w:num w:numId="19" w16cid:durableId="2008047080">
     <w:abstractNumId w:val="6"/>
   </w:num>
   <w:num w:numId="20" w16cid:durableId="1918588551">
-    <w:abstractNumId w:val="33"/>
+    <w:abstractNumId w:val="35"/>
   </w:num>
   <w:num w:numId="21" w16cid:durableId="1895969859">
-    <w:abstractNumId w:val="20"/>
+    <w:abstractNumId w:val="22"/>
   </w:num>
   <w:num w:numId="22" w16cid:durableId="1807039801">
     <w:abstractNumId w:val="16"/>
@@ -11579,7 +11868,7 @@
     <w:abstractNumId w:val="1"/>
   </w:num>
   <w:num w:numId="24" w16cid:durableId="1008289093">
-    <w:abstractNumId w:val="28"/>
+    <w:abstractNumId w:val="30"/>
   </w:num>
   <w:num w:numId="25" w16cid:durableId="282924289">
     <w:abstractNumId w:val="18"/>
@@ -11588,28 +11877,28 @@
     <w:abstractNumId w:val="3"/>
   </w:num>
   <w:num w:numId="27" w16cid:durableId="239291338">
-    <w:abstractNumId w:val="40"/>
+    <w:abstractNumId w:val="42"/>
   </w:num>
   <w:num w:numId="28" w16cid:durableId="1552496065">
-    <w:abstractNumId w:val="29"/>
+    <w:abstractNumId w:val="31"/>
   </w:num>
   <w:num w:numId="29" w16cid:durableId="1248345279">
-    <w:abstractNumId w:val="34"/>
+    <w:abstractNumId w:val="36"/>
   </w:num>
   <w:num w:numId="30" w16cid:durableId="1399207462">
-    <w:abstractNumId w:val="19"/>
+    <w:abstractNumId w:val="20"/>
   </w:num>
   <w:num w:numId="31" w16cid:durableId="1079715173">
     <w:abstractNumId w:val="9"/>
   </w:num>
   <w:num w:numId="32" w16cid:durableId="2134055827">
-    <w:abstractNumId w:val="21"/>
+    <w:abstractNumId w:val="23"/>
   </w:num>
   <w:num w:numId="33" w16cid:durableId="25718754">
     <w:abstractNumId w:val="10"/>
   </w:num>
   <w:num w:numId="34" w16cid:durableId="685909321">
-    <w:abstractNumId w:val="43"/>
+    <w:abstractNumId w:val="45"/>
   </w:num>
   <w:num w:numId="35" w16cid:durableId="486433241">
     <w:abstractNumId w:val="14"/>
@@ -11621,25 +11910,31 @@
     <w:abstractNumId w:val="15"/>
   </w:num>
   <w:num w:numId="38" w16cid:durableId="1397893692">
-    <w:abstractNumId w:val="38"/>
+    <w:abstractNumId w:val="40"/>
   </w:num>
   <w:num w:numId="39" w16cid:durableId="1138301689">
     <w:abstractNumId w:val="11"/>
   </w:num>
   <w:num w:numId="40" w16cid:durableId="661659978">
-    <w:abstractNumId w:val="42"/>
+    <w:abstractNumId w:val="44"/>
   </w:num>
   <w:num w:numId="41" w16cid:durableId="389378832">
-    <w:abstractNumId w:val="25"/>
+    <w:abstractNumId w:val="27"/>
   </w:num>
   <w:num w:numId="42" w16cid:durableId="1637100369">
     <w:abstractNumId w:val="13"/>
   </w:num>
   <w:num w:numId="43" w16cid:durableId="912275380">
-    <w:abstractNumId w:val="39"/>
+    <w:abstractNumId w:val="41"/>
   </w:num>
   <w:num w:numId="44" w16cid:durableId="342706613">
-    <w:abstractNumId w:val="22"/>
+    <w:abstractNumId w:val="24"/>
+  </w:num>
+  <w:num w:numId="45" w16cid:durableId="1758401611">
+    <w:abstractNumId w:val="21"/>
+  </w:num>
+  <w:num w:numId="46" w16cid:durableId="1065957878">
+    <w:abstractNumId w:val="19"/>
   </w:num>
   <w:numIdMacAtCleanup w:val="10"/>
 </w:numbering>
@@ -12256,6 +12551,7 @@
   <w:style w:type="character" w:default="1" w:styleId="a0">
     <w:name w:val="Default Paragraph Font"/>
     <w:uiPriority w:val="1"/>
+    <w:semiHidden/>
     <w:unhideWhenUsed/>
   </w:style>
   <w:style w:type="table" w:default="1" w:styleId="a1">

</xml_diff>